<commit_message>
Update AquiferOpenStudyNotesBookIntroSummaries for 2026-08-25
</commit_message>
<xml_diff>
--- a/arb/docx/01.content.docx
+++ b/arb/docx/01.content.docx
@@ -9,6 +9,8 @@
       </w:pPr>
       <w:r>
         <w:rPr>
+          <w:rtl/>
+          <w:cs/>
           <w:lang w:val="ar_AE" w:bidi="ar_AE"/>
         </w:rPr>
       </w:r>
@@ -20,12 +22,16 @@
       </w:pPr>
       <w:r>
         <w:rPr>
+          <w:rtl/>
+          <w:cs/>
           <w:lang w:val="ar_AE" w:bidi="ar_AE"/>
         </w:rPr>
         <w:t>Resource: Aquifer Open Study Notes (Book Intro Summaries)</w:t>
       </w:r>
       <w:r>
         <w:rPr>
+          <w:rtl/>
+          <w:cs/>
           <w:lang w:val="ar_AE" w:bidi="ar_AE"/>
         </w:rPr>
       </w:r>
@@ -36,12 +42,16 @@
       </w:pPr>
       <w:r>
         <w:rPr>
+          <w:rtl/>
+          <w:cs/>
           <w:lang w:val="ar_AE" w:bidi="ar_AE"/>
         </w:rPr>
       </w:r>
       <w:r>
         <w:rPr>
           <w:b/>
+          <w:rtl/>
+          <w:cs/>
           <w:lang w:val="ar_AE" w:bidi="ar_AE"/>
         </w:rPr>
         <w:t>Aquifer Open Study Notes (Book Intro Summaries)</w:t>
@@ -53,35 +63,47 @@
       </w:pPr>
       <w:r>
         <w:rPr>
+          <w:rtl/>
+          <w:cs/>
           <w:lang w:val="ar_AE" w:bidi="ar_AE"/>
         </w:rPr>
       </w:r>
       <w:r>
         <w:rPr>
+          <w:rtl/>
+          <w:cs/>
           <w:lang w:val="ar_AE" w:bidi="ar_AE"/>
         </w:rPr>
         <w:t xml:space="preserve">This work is an adaptation of </w:t>
       </w:r>
       <w:r>
         <w:rPr>
+          <w:rtl/>
+          <w:cs/>
           <w:lang w:val="ar_AE" w:bidi="ar_AE"/>
         </w:rPr>
         <w:t>Tyndale Open Study Notes</w:t>
       </w:r>
       <w:r>
         <w:rPr>
+          <w:rtl/>
+          <w:cs/>
           <w:lang w:val="ar_AE" w:bidi="ar_AE"/>
         </w:rPr>
         <w:t xml:space="preserve"> © 2023 Tyndale House Publishers, licensed under the CC BY-SA 4.0 license. The adaptation, </w:t>
       </w:r>
       <w:r>
         <w:rPr>
+          <w:rtl/>
+          <w:cs/>
           <w:lang w:val="ar_AE" w:bidi="ar_AE"/>
         </w:rPr>
         <w:t>Aquifer Open Study Notes</w:t>
       </w:r>
       <w:r>
         <w:rPr>
+          <w:rtl/>
+          <w:cs/>
           <w:lang w:val="ar_AE" w:bidi="ar_AE"/>
         </w:rPr>
         <w:t>, was created by Mission Mutual and is also licensed under CC BY-SA 4.0.</w:t>
@@ -93,22 +115,30 @@
       </w:pPr>
       <w:r>
         <w:rPr>
+          <w:rtl/>
+          <w:cs/>
           <w:lang w:val="ar_AE" w:bidi="ar_AE"/>
         </w:rPr>
       </w:r>
       <w:r>
         <w:rPr>
+          <w:rtl/>
+          <w:cs/>
           <w:lang w:val="ar_AE" w:bidi="ar_AE"/>
         </w:rPr>
         <w:t>This resource has been adapted into multiple languages, including English, Tok Pisin, Arabic (عربي), French (Français), Hindi (हिंदी), Indonesian (Bahasa Indonesia), Portuguese (Português), Russian (Русский), Spanish (Español), Swahili (Kiswahili), and Simplified Chinese (简体中文).</w:t>
       </w:r>
       <w:r>
         <w:rPr>
+          <w:rtl/>
+          <w:cs/>
           <w:lang w:val="ar_AE" w:bidi="ar_AE"/>
         </w:rPr>
       </w:r>
       <w:r>
         <w:rPr>
+          <w:rtl/>
+          <w:cs/>
           <w:lang w:val="ar_AE" w:bidi="ar_AE"/>
         </w:rPr>
       </w:r>
@@ -120,6 +150,8 @@
       </w:pPr>
       <w:r>
         <w:rPr>
+          <w:rtl/>
+          <w:cs/>
           <w:lang w:val="ar_AE" w:bidi="ar_AE"/>
         </w:rPr>
         <w:t>Aquifer Open Study Notes (Book Intro Summaries)</w:t>
@@ -149,6 +181,8 @@
       </w:pPr>
       <w:r>
         <w:rPr>
+          <w:rtl/>
+          <w:cs/>
           <w:lang w:val="ar_AE" w:bidi="ar_AE"/>
         </w:rPr>
       </w:r>
@@ -160,12 +194,16 @@
       </w:pPr>
       <w:r>
         <w:rPr>
+          <w:rtl/>
+          <w:cs/>
           <w:lang w:val="ar_AE" w:bidi="ar_AE"/>
         </w:rPr>
         <w:t>GEN</w:t>
       </w:r>
       <w:r>
         <w:rPr>
+          <w:rtl/>
+          <w:cs/>
           <w:lang w:val="ar_AE" w:bidi="ar_AE"/>
         </w:rPr>
       </w:r>
@@ -176,22 +214,30 @@
       </w:pPr>
       <w:r>
         <w:rPr>
+          <w:rtl/>
+          <w:cs/>
           <w:lang w:val="ar_AE" w:bidi="ar_AE"/>
         </w:rPr>
       </w:r>
       <w:r>
         <w:rPr>
+          <w:rtl/>
+          <w:cs/>
           <w:lang w:val="ar_AE" w:bidi="ar_AE"/>
         </w:rPr>
         <w:t xml:space="preserve"> </w:t>
       </w:r>
       <w:r>
         <w:rPr>
+          <w:rtl/>
+          <w:cs/>
           <w:lang w:val="ar_AE" w:bidi="ar_AE"/>
         </w:rPr>
       </w:r>
       <w:r>
         <w:rPr>
+          <w:rtl/>
+          <w:cs/>
           <w:lang w:val="ar_AE" w:bidi="ar_AE"/>
         </w:rPr>
       </w:r>
@@ -217,6 +263,8 @@
       </w:pPr>
       <w:r>
         <w:rPr>
+          <w:rtl/>
+          <w:cs/>
           <w:lang w:val="ar_AE" w:bidi="ar_AE"/>
         </w:rPr>
       </w:r>
@@ -228,12 +276,16 @@
       </w:pPr>
       <w:r>
         <w:rPr>
+          <w:rtl/>
+          <w:cs/>
           <w:lang w:val="ar_AE" w:bidi="ar_AE"/>
         </w:rPr>
         <w:t>سفر التكوين</w:t>
       </w:r>
       <w:r>
         <w:rPr>
+          <w:rtl/>
+          <w:cs/>
           <w:lang w:val="ar_AE" w:bidi="ar_AE"/>
         </w:rPr>
       </w:r>
@@ -244,11 +296,15 @@
       </w:pPr>
       <w:r>
         <w:rPr>
+          <w:rtl/>
+          <w:cs/>
           <w:lang w:val="ar_AE" w:bidi="ar_AE"/>
         </w:rPr>
       </w:r>
       <w:r>
         <w:rPr>
+          <w:rtl/>
+          <w:cs/>
           <w:lang w:val="ar_AE" w:bidi="ar_AE"/>
         </w:rPr>
         <w:t>سِفر التكوين</w:t>
@@ -261,6 +317,8 @@
       </w:pPr>
       <w:r>
         <w:rPr>
+          <w:rtl/>
+          <w:cs/>
           <w:lang w:val="ar_AE" w:bidi="ar_AE"/>
         </w:rPr>
         <w:t>الهدف</w:t>
@@ -272,11 +330,15 @@
       </w:pPr>
       <w:r>
         <w:rPr>
+          <w:rtl/>
+          <w:cs/>
           <w:lang w:val="ar_AE" w:bidi="ar_AE"/>
         </w:rPr>
       </w:r>
       <w:r>
         <w:rPr>
+          <w:rtl/>
+          <w:cs/>
           <w:lang w:val="ar_AE" w:bidi="ar_AE"/>
         </w:rPr>
         <w:t>تتبع تأسيس خطة الله لإماتة الخطيَّة عبْر شعبه المختار، إسرائيل</w:t>
@@ -289,6 +351,8 @@
       </w:pPr>
       <w:r>
         <w:rPr>
+          <w:rtl/>
+          <w:cs/>
           <w:lang w:val="ar_AE" w:bidi="ar_AE"/>
         </w:rPr>
         <w:t>الكاتب</w:t>
@@ -300,11 +364,15 @@
       </w:pPr>
       <w:r>
         <w:rPr>
+          <w:rtl/>
+          <w:cs/>
           <w:lang w:val="ar_AE" w:bidi="ar_AE"/>
         </w:rPr>
       </w:r>
       <w:r>
         <w:rPr>
+          <w:rtl/>
+          <w:cs/>
           <w:lang w:val="ar_AE" w:bidi="ar_AE"/>
         </w:rPr>
         <w:t>موسى، بحسب التقليد</w:t>
@@ -317,6 +385,8 @@
       </w:pPr>
       <w:r>
         <w:rPr>
+          <w:rtl/>
+          <w:cs/>
           <w:lang w:val="ar_AE" w:bidi="ar_AE"/>
         </w:rPr>
         <w:t>الزمن</w:t>
@@ -328,11 +398,15 @@
       </w:pPr>
       <w:r>
         <w:rPr>
+          <w:rtl/>
+          <w:cs/>
           <w:lang w:val="ar_AE" w:bidi="ar_AE"/>
         </w:rPr>
       </w:r>
       <w:r>
         <w:rPr>
+          <w:rtl/>
+          <w:cs/>
           <w:lang w:val="ar_AE" w:bidi="ar_AE"/>
         </w:rPr>
         <w:t>يسجل الأحداث وأحداث البداءات من فترة الآباء الأوائل (نحو 2100–1700 قبل الميلاد)</w:t>
@@ -345,6 +419,8 @@
       </w:pPr>
       <w:r>
         <w:rPr>
+          <w:rtl/>
+          <w:cs/>
           <w:lang w:val="ar_AE" w:bidi="ar_AE"/>
         </w:rPr>
         <w:t>السياق</w:t>
@@ -356,22 +432,30 @@
       </w:pPr>
       <w:r>
         <w:rPr>
+          <w:rtl/>
+          <w:cs/>
           <w:lang w:val="ar_AE" w:bidi="ar_AE"/>
         </w:rPr>
       </w:r>
       <w:r>
         <w:rPr>
+          <w:rtl/>
+          <w:cs/>
           <w:lang w:val="ar_AE" w:bidi="ar_AE"/>
         </w:rPr>
         <w:t>أماكن متعددة في الشرق الأوسط، تركِّز أساسًا على الآباء الأوائل خلال فترة وجودهم في أرض كنعان ومصر</w:t>
       </w:r>
       <w:r>
         <w:rPr>
+          <w:rtl/>
+          <w:cs/>
           <w:lang w:val="ar_AE" w:bidi="ar_AE"/>
         </w:rPr>
       </w:r>
       <w:r>
         <w:rPr>
+          <w:rtl/>
+          <w:cs/>
           <w:lang w:val="ar_AE" w:bidi="ar_AE"/>
         </w:rPr>
       </w:r>

</xml_diff>